<commit_message>
docs(pecuario): diagramas de flujo/menu/entidades + casos de uso resueltos
Agrega al manual de usuario y al documento de diseno tres diagramas Mermaid
renderizados como imagen: flujo general del proceso (ganaderia individual vs
lote avicola/engorde), arbol de opciones del menu, y el diagrama de entidades
tecnico (anexo). El .md unico ahora tambien documenta los casos de uso
resueltos paso a paso (ciclo reproductivo, baja por venta, ciclo de
incubacion) y deja abierta la decision de enriquecer PC_ESPECIE con periodo
de gestacion/incubacion por especie (se investigo y descarto reutilizar
TG_ESPECIES, que es el catalogo real de especies hidrobiologicas/vegetales
del modulo de pesca, con 15 FK reales en produccion).

Co-Authored-By: Claude Sonnet 5 <noreply@anthropic.com>
</commit_message>
<xml_diff>
--- a/Source ERPs/metadata SIGRE/pecuario/Manual_Usuario_Modulo_Pecuario.docx
+++ b/Source ERPs/metadata SIGRE/pecuario/Manual_Usuario_Modulo_Pecuario.docx
@@ -217,6 +217,63 @@
     </w:p>
     <w:p>
       <w:pPr>
+        <w:pStyle w:val="Heading2"/>
+      </w:pPr>
+      <w:r>
+        <w:t>1.2 Flujo general del proceso</w:t>
+      </w:r>
+    </w:p>
+    <w:p>
+      <w:r>
+        <w:t>El siguiente diagrama resume el procedimiento completo del modulo, separando el camino de manejo individual (bovino, porcino, caprino, ovino, equino) del camino de manejo por lote (aves, engorde masivo):</w:t>
+      </w:r>
+    </w:p>
+    <w:p>
+      <w:pPr>
+        <w:jc w:val="center"/>
+      </w:pPr>
+      <w:r>
+        <w:drawing>
+          <wp:inline xmlns:a="http://schemas.openxmlformats.org/drawingml/2006/main" xmlns:pic="http://schemas.openxmlformats.org/drawingml/2006/picture">
+            <wp:extent cx="5760720" cy="6087011"/>
+            <wp:docPr id="1" name="Picture 1"/>
+            <wp:cNvGraphicFramePr>
+              <a:graphicFrameLocks noChangeAspect="1"/>
+            </wp:cNvGraphicFramePr>
+            <a:graphic>
+              <a:graphicData uri="http://schemas.openxmlformats.org/drawingml/2006/picture">
+                <pic:pic>
+                  <pic:nvPicPr>
+                    <pic:cNvPr id="0" name="flujo_procedimiento.png"/>
+                    <pic:cNvPicPr/>
+                  </pic:nvPicPr>
+                  <pic:blipFill>
+                    <a:blip r:embed="rId9"/>
+                    <a:stretch>
+                      <a:fillRect/>
+                    </a:stretch>
+                  </pic:blipFill>
+                  <pic:spPr>
+                    <a:xfrm>
+                      <a:off x="0" y="0"/>
+                      <a:ext cx="5760720" cy="6087011"/>
+                    </a:xfrm>
+                    <a:prstGeom prst="rect"/>
+                  </pic:spPr>
+                </pic:pic>
+              </a:graphicData>
+            </a:graphic>
+          </wp:inline>
+        </w:drawing>
+      </w:r>
+    </w:p>
+    <w:p>
+      <w:r>
+        <w:br w:type="page"/>
+      </w:r>
+    </w:p>
+    <w:p>
+      <w:pPr>
         <w:pStyle w:val="Heading1"/>
       </w:pPr>
       <w:r>
@@ -2010,6 +2067,58 @@
       </w:tr>
     </w:tbl>
     <w:p/>
+    <w:p>
+      <w:pPr>
+        <w:pStyle w:val="Heading2"/>
+      </w:pPr>
+      <w:r>
+        <w:t>2.2 Diagrama de opciones del menu</w:t>
+      </w:r>
+    </w:p>
+    <w:p>
+      <w:r>
+        <w:t>Vista agrupada de las 49 opciones nuevas por tipo:</w:t>
+      </w:r>
+    </w:p>
+    <w:p>
+      <w:pPr>
+        <w:jc w:val="center"/>
+      </w:pPr>
+      <w:r>
+        <w:drawing>
+          <wp:inline xmlns:a="http://schemas.openxmlformats.org/drawingml/2006/main" xmlns:pic="http://schemas.openxmlformats.org/drawingml/2006/picture">
+            <wp:extent cx="5943600" cy="2124955"/>
+            <wp:docPr id="2" name="Picture 2"/>
+            <wp:cNvGraphicFramePr>
+              <a:graphicFrameLocks noChangeAspect="1"/>
+            </wp:cNvGraphicFramePr>
+            <a:graphic>
+              <a:graphicData uri="http://schemas.openxmlformats.org/drawingml/2006/picture">
+                <pic:pic>
+                  <pic:nvPicPr>
+                    <pic:cNvPr id="0" name="opciones_menu.png"/>
+                    <pic:cNvPicPr/>
+                  </pic:nvPicPr>
+                  <pic:blipFill>
+                    <a:blip r:embed="rId10"/>
+                    <a:stretch>
+                      <a:fillRect/>
+                    </a:stretch>
+                  </pic:blipFill>
+                  <pic:spPr>
+                    <a:xfrm>
+                      <a:off x="0" y="0"/>
+                      <a:ext cx="5943600" cy="2124955"/>
+                    </a:xfrm>
+                    <a:prstGeom prst="rect"/>
+                  </pic:spPr>
+                </pic:pic>
+              </a:graphicData>
+            </a:graphic>
+          </wp:inline>
+        </w:drawing>
+      </w:r>
+    </w:p>
     <w:p>
       <w:r>
         <w:br w:type="page"/>
@@ -5809,6 +5918,78 @@
       </w:tr>
     </w:tbl>
     <w:p/>
+    <w:p>
+      <w:r>
+        <w:br w:type="page"/>
+      </w:r>
+    </w:p>
+    <w:p>
+      <w:pPr>
+        <w:pStyle w:val="Heading1"/>
+      </w:pPr>
+      <w:r>
+        <w:t>18. Anexo: diagrama de entidades (modelo de datos)</w:t>
+      </w:r>
+    </w:p>
+    <w:p>
+      <w:r>
+        <w:t>Diagrama tecnico del modelo de datos completo (todas las tablas PC_* y su relacion con las tablas genericas del ERP: ORDEN_TRABAJO, OPERACIONES, ARTICULO_MOV, ORDEN_SERVICIO, ORDEN_VENTA). Esta seccion es de referencia tecnica; el personal operativo no necesita interpretarla para usar el modulo.</w:t>
+      </w:r>
+    </w:p>
+    <w:p>
+      <w:pPr>
+        <w:jc w:val="center"/>
+      </w:pPr>
+      <w:r>
+        <w:drawing>
+          <wp:inline xmlns:a="http://schemas.openxmlformats.org/drawingml/2006/main" xmlns:pic="http://schemas.openxmlformats.org/drawingml/2006/picture">
+            <wp:extent cx="8229600" cy="1732547"/>
+            <wp:docPr id="3" name="Picture 3"/>
+            <wp:cNvGraphicFramePr>
+              <a:graphicFrameLocks noChangeAspect="1"/>
+            </wp:cNvGraphicFramePr>
+            <a:graphic>
+              <a:graphicData uri="http://schemas.openxmlformats.org/drawingml/2006/picture">
+                <pic:pic>
+                  <pic:nvPicPr>
+                    <pic:cNvPr id="0" name="diagrama_entidades.png"/>
+                    <pic:cNvPicPr/>
+                  </pic:nvPicPr>
+                  <pic:blipFill>
+                    <a:blip r:embed="rId11"/>
+                    <a:stretch>
+                      <a:fillRect/>
+                    </a:stretch>
+                  </pic:blipFill>
+                  <pic:spPr>
+                    <a:xfrm>
+                      <a:off x="0" y="0"/>
+                      <a:ext cx="8229600" cy="1732547"/>
+                    </a:xfrm>
+                    <a:prstGeom prst="rect"/>
+                  </pic:spPr>
+                </pic:pic>
+              </a:graphicData>
+            </a:graphic>
+          </wp:inline>
+        </w:drawing>
+      </w:r>
+    </w:p>
+    <w:p>
+      <w:r>
+        <w:rPr>
+          <w:b/>
+          <w:i/>
+        </w:rPr>
+        <w:t xml:space="preserve">Nota: </w:t>
+      </w:r>
+      <w:r>
+        <w:rPr>
+          <w:i/>
+        </w:rPr>
+        <w:t>el diagrama es denso por la cantidad de tablas; se recomienda hacer zoom (Word: Ctrl + rueda del mouse) para leer los nombres de columnas y relaciones.</w:t>
+      </w:r>
+    </w:p>
     <w:sectPr>
       <w:pgSz w:w="12240" w:h="15840"/>
       <w:pgMar w:top="1440" w:right="1800" w:bottom="1440" w:left="1800" w:header="720" w:footer="720" w:gutter="0"/>

</xml_diff>

<commit_message>
docs(pecuario): asientos de ejemplo completos (alta, compra, revaluacion de cierre)
Agrega 3 asientos de ejemplo con la estructura real CNTBL_PRE_ASIENTO /
CNTBL_PRE_ASIENTO_DET (cabecera + detalle, mismos nombres de campo que las
tablas reales): alta por nacimiento (SU00000004, cria de Paloma, S/ 1,500),
alta por compra (ilustrativo, S/ 30,000), y revaluacion de cierre 31/12/2026
combinando ganancia (Paloma y Luna suben de valor) y perdida (ejemplo de
descarte por vejez) en el mismo asiento, cuadrando en S/ 4,200 debe/haber.
Los codigos de cuenta (35110101, 76201101, 66201101) se marcan como
propuestos, no reales, siguiendo el patron de 8 digitos de CNTBL_CNTA.

Co-Authored-By: Claude Sonnet 5 <noreply@anthropic.com>
</commit_message>
<xml_diff>
--- a/Source ERPs/metadata SIGRE/pecuario/Manual_Usuario_Modulo_Pecuario.docx
+++ b/Source ERPs/metadata SIGRE/pecuario/Manual_Usuario_Modulo_Pecuario.docx
@@ -6331,6 +6331,827 @@
         <w:t>Se verifico contra el plan de cuentas real de la empresa: hoy NO existen las cuentas 35 (Activos biologicos) ni 76 (Ganancia por medicion a valor razonable) — el plan de cuentas actual es el de la operacion pesquera existente. Hay que darlas de alta antes de activar cualquier generacion automatica de asientos para Pecuario. La cuenta 66 ya existe pero para un concepto distinto (perdida en activos mantenidos para la venta); no debe reutilizarse, hay que crear una subcuenta propia.</w:t>
       </w:r>
     </w:p>
+    <w:p>
+      <w:pPr>
+        <w:pStyle w:val="Heading2"/>
+      </w:pPr>
+      <w:r>
+        <w:t>19.5 Asientos de ejemplo con animales del escenario de prueba</w:t>
+      </w:r>
+    </w:p>
+    <w:p>
+      <w:r>
+        <w:t>Ejemplos completos usando la misma estructura real de asiento contable (cabecera + detalle) que ya usa el sistema. Los codigos de cuenta (35110101, 76201101, 66201101) son propuestos, no existen aun (ver 19.4) — el codigo definitivo lo asigna el contador al darlas de alta.</w:t>
+      </w:r>
+    </w:p>
+    <w:p>
+      <w:pPr>
+        <w:pStyle w:val="Heading3"/>
+      </w:pPr>
+      <w:r>
+        <w:t>Ejemplo 1 - Alta por nacimiento (SU00000004, cria de Paloma, 15/06/2026)</w:t>
+      </w:r>
+    </w:p>
+    <w:tbl>
+      <w:tblPr>
+        <w:tblStyle w:val="LightGrid-Accent1"/>
+        <w:tblW w:type="auto" w:w="0"/>
+        <w:jc w:val="center"/>
+        <w:tblLook w:firstColumn="1" w:firstRow="1" w:lastColumn="0" w:lastRow="0" w:noHBand="0" w:noVBand="1" w:val="04A0"/>
+      </w:tblPr>
+      <w:tblGrid>
+        <w:gridCol w:w="1728"/>
+        <w:gridCol w:w="1728"/>
+        <w:gridCol w:w="1728"/>
+        <w:gridCol w:w="1728"/>
+        <w:gridCol w:w="1728"/>
+      </w:tblGrid>
+      <w:tr>
+        <w:tc>
+          <w:tcPr>
+            <w:tcW w:type="dxa" w:w="1134"/>
+          </w:tcPr>
+          <w:p>
+            <w:r>
+              <w:rPr>
+                <w:b/>
+              </w:rPr>
+              <w:t>Item</w:t>
+            </w:r>
+          </w:p>
+        </w:tc>
+        <w:tc>
+          <w:tcPr>
+            <w:tcW w:type="dxa" w:w="2835"/>
+          </w:tcPr>
+          <w:p>
+            <w:r>
+              <w:rPr>
+                <w:b/>
+              </w:rPr>
+              <w:t>Cuenta</w:t>
+            </w:r>
+          </w:p>
+        </w:tc>
+        <w:tc>
+          <w:tcPr>
+            <w:tcW w:type="dxa" w:w="1134"/>
+          </w:tcPr>
+          <w:p>
+            <w:r>
+              <w:rPr>
+                <w:b/>
+              </w:rPr>
+              <w:t>D/H</w:t>
+            </w:r>
+          </w:p>
+        </w:tc>
+        <w:tc>
+          <w:tcPr>
+            <w:tcW w:type="dxa" w:w="3402"/>
+          </w:tcPr>
+          <w:p>
+            <w:r>
+              <w:rPr>
+                <w:b/>
+              </w:rPr>
+              <w:t>Detalle</w:t>
+            </w:r>
+          </w:p>
+        </w:tc>
+        <w:tc>
+          <w:tcPr>
+            <w:tcW w:type="dxa" w:w="1701"/>
+          </w:tcPr>
+          <w:p>
+            <w:r>
+              <w:rPr>
+                <w:b/>
+              </w:rPr>
+              <w:t>Monto (S/)</w:t>
+            </w:r>
+          </w:p>
+        </w:tc>
+      </w:tr>
+      <w:tr>
+        <w:tc>
+          <w:tcPr>
+            <w:tcW w:type="dxa" w:w="1134"/>
+          </w:tcPr>
+          <w:p>
+            <w:r>
+              <w:t>1</w:t>
+            </w:r>
+          </w:p>
+        </w:tc>
+        <w:tc>
+          <w:tcPr>
+            <w:tcW w:type="dxa" w:w="2835"/>
+          </w:tcPr>
+          <w:p>
+            <w:r>
+              <w:t>35110101 (Activo biologico - Origen animal)</w:t>
+            </w:r>
+          </w:p>
+        </w:tc>
+        <w:tc>
+          <w:tcPr>
+            <w:tcW w:type="dxa" w:w="1134"/>
+          </w:tcPr>
+          <w:p>
+            <w:r>
+              <w:t>D</w:t>
+            </w:r>
+          </w:p>
+        </w:tc>
+        <w:tc>
+          <w:tcPr>
+            <w:tcW w:type="dxa" w:w="3402"/>
+          </w:tcPr>
+          <w:p>
+            <w:r>
+              <w:t>Alta cria SU00000004 a valor razonable</w:t>
+            </w:r>
+          </w:p>
+        </w:tc>
+        <w:tc>
+          <w:tcPr>
+            <w:tcW w:type="dxa" w:w="1701"/>
+          </w:tcPr>
+          <w:p>
+            <w:r>
+              <w:t>1,500.00</w:t>
+            </w:r>
+          </w:p>
+        </w:tc>
+      </w:tr>
+      <w:tr>
+        <w:tc>
+          <w:tcPr>
+            <w:tcW w:type="dxa" w:w="1134"/>
+          </w:tcPr>
+          <w:p>
+            <w:r>
+              <w:t>2</w:t>
+            </w:r>
+          </w:p>
+        </w:tc>
+        <w:tc>
+          <w:tcPr>
+            <w:tcW w:type="dxa" w:w="2835"/>
+          </w:tcPr>
+          <w:p>
+            <w:r>
+              <w:t>76201101 (Ganancia por medicion a valor razonable)</w:t>
+            </w:r>
+          </w:p>
+        </w:tc>
+        <w:tc>
+          <w:tcPr>
+            <w:tcW w:type="dxa" w:w="1134"/>
+          </w:tcPr>
+          <w:p>
+            <w:r>
+              <w:t>H</w:t>
+            </w:r>
+          </w:p>
+        </w:tc>
+        <w:tc>
+          <w:tcPr>
+            <w:tcW w:type="dxa" w:w="3402"/>
+          </w:tcPr>
+          <w:p>
+            <w:r>
+              <w:t>Ganancia por reconocimiento inicial</w:t>
+            </w:r>
+          </w:p>
+        </w:tc>
+        <w:tc>
+          <w:tcPr>
+            <w:tcW w:type="dxa" w:w="1701"/>
+          </w:tcPr>
+          <w:p>
+            <w:r>
+              <w:t>1,500.00</w:t>
+            </w:r>
+          </w:p>
+        </w:tc>
+      </w:tr>
+    </w:tbl>
+    <w:p/>
+    <w:p>
+      <w:pPr>
+        <w:pStyle w:val="Heading3"/>
+      </w:pPr>
+      <w:r>
+        <w:t>Ejemplo 2 - Alta por compra (ilustrativo; el demo no tiene compras)</w:t>
+      </w:r>
+    </w:p>
+    <w:tbl>
+      <w:tblPr>
+        <w:tblStyle w:val="LightGrid-Accent1"/>
+        <w:tblW w:type="auto" w:w="0"/>
+        <w:jc w:val="center"/>
+        <w:tblLook w:firstColumn="1" w:firstRow="1" w:lastColumn="0" w:lastRow="0" w:noHBand="0" w:noVBand="1" w:val="04A0"/>
+      </w:tblPr>
+      <w:tblGrid>
+        <w:gridCol w:w="1728"/>
+        <w:gridCol w:w="1728"/>
+        <w:gridCol w:w="1728"/>
+        <w:gridCol w:w="1728"/>
+        <w:gridCol w:w="1728"/>
+      </w:tblGrid>
+      <w:tr>
+        <w:tc>
+          <w:tcPr>
+            <w:tcW w:type="dxa" w:w="1134"/>
+          </w:tcPr>
+          <w:p>
+            <w:r>
+              <w:rPr>
+                <w:b/>
+              </w:rPr>
+              <w:t>Item</w:t>
+            </w:r>
+          </w:p>
+        </w:tc>
+        <w:tc>
+          <w:tcPr>
+            <w:tcW w:type="dxa" w:w="2835"/>
+          </w:tcPr>
+          <w:p>
+            <w:r>
+              <w:rPr>
+                <w:b/>
+              </w:rPr>
+              <w:t>Cuenta</w:t>
+            </w:r>
+          </w:p>
+        </w:tc>
+        <w:tc>
+          <w:tcPr>
+            <w:tcW w:type="dxa" w:w="1134"/>
+          </w:tcPr>
+          <w:p>
+            <w:r>
+              <w:rPr>
+                <w:b/>
+              </w:rPr>
+              <w:t>D/H</w:t>
+            </w:r>
+          </w:p>
+        </w:tc>
+        <w:tc>
+          <w:tcPr>
+            <w:tcW w:type="dxa" w:w="3402"/>
+          </w:tcPr>
+          <w:p>
+            <w:r>
+              <w:rPr>
+                <w:b/>
+              </w:rPr>
+              <w:t>Detalle</w:t>
+            </w:r>
+          </w:p>
+        </w:tc>
+        <w:tc>
+          <w:tcPr>
+            <w:tcW w:type="dxa" w:w="1701"/>
+          </w:tcPr>
+          <w:p>
+            <w:r>
+              <w:rPr>
+                <w:b/>
+              </w:rPr>
+              <w:t>Monto (S/)</w:t>
+            </w:r>
+          </w:p>
+        </w:tc>
+      </w:tr>
+      <w:tr>
+        <w:tc>
+          <w:tcPr>
+            <w:tcW w:type="dxa" w:w="1134"/>
+          </w:tcPr>
+          <w:p>
+            <w:r>
+              <w:t>1</w:t>
+            </w:r>
+          </w:p>
+        </w:tc>
+        <w:tc>
+          <w:tcPr>
+            <w:tcW w:type="dxa" w:w="2835"/>
+          </w:tcPr>
+          <w:p>
+            <w:r>
+              <w:t>35110101 (Activo biologico - Origen animal)</w:t>
+            </w:r>
+          </w:p>
+        </w:tc>
+        <w:tc>
+          <w:tcPr>
+            <w:tcW w:type="dxa" w:w="1134"/>
+          </w:tcPr>
+          <w:p>
+            <w:r>
+              <w:t>D</w:t>
+            </w:r>
+          </w:p>
+        </w:tc>
+        <w:tc>
+          <w:tcPr>
+            <w:tcW w:type="dxa" w:w="3402"/>
+          </w:tcPr>
+          <w:p>
+            <w:r>
+              <w:t>Compra de vaquillona a valor razonable</w:t>
+            </w:r>
+          </w:p>
+        </w:tc>
+        <w:tc>
+          <w:tcPr>
+            <w:tcW w:type="dxa" w:w="1701"/>
+          </w:tcPr>
+          <w:p>
+            <w:r>
+              <w:t>30,000.00</w:t>
+            </w:r>
+          </w:p>
+        </w:tc>
+      </w:tr>
+      <w:tr>
+        <w:tc>
+          <w:tcPr>
+            <w:tcW w:type="dxa" w:w="1134"/>
+          </w:tcPr>
+          <w:p>
+            <w:r>
+              <w:t>2</w:t>
+            </w:r>
+          </w:p>
+        </w:tc>
+        <w:tc>
+          <w:tcPr>
+            <w:tcW w:type="dxa" w:w="2835"/>
+          </w:tcPr>
+          <w:p>
+            <w:r>
+              <w:t>46 Cuentas por pagar diversas</w:t>
+            </w:r>
+          </w:p>
+        </w:tc>
+        <w:tc>
+          <w:tcPr>
+            <w:tcW w:type="dxa" w:w="1134"/>
+          </w:tcPr>
+          <w:p>
+            <w:r>
+              <w:t>H</w:t>
+            </w:r>
+          </w:p>
+        </w:tc>
+        <w:tc>
+          <w:tcPr>
+            <w:tcW w:type="dxa" w:w="3402"/>
+          </w:tcPr>
+          <w:p>
+            <w:r>
+              <w:t>Factura de compra pendiente de pago</w:t>
+            </w:r>
+          </w:p>
+        </w:tc>
+        <w:tc>
+          <w:tcPr>
+            <w:tcW w:type="dxa" w:w="1701"/>
+          </w:tcPr>
+          <w:p>
+            <w:r>
+              <w:t>30,000.00</w:t>
+            </w:r>
+          </w:p>
+        </w:tc>
+      </w:tr>
+    </w:tbl>
+    <w:p/>
+    <w:p>
+      <w:pPr>
+        <w:pStyle w:val="Heading3"/>
+      </w:pPr>
+      <w:r>
+        <w:t>Ejemplo 3 - Revaluacion de cierre (31/12/2026, categoria Vaca en produccion)</w:t>
+      </w:r>
+    </w:p>
+    <w:tbl>
+      <w:tblPr>
+        <w:tblStyle w:val="LightGrid-Accent1"/>
+        <w:tblW w:type="auto" w:w="0"/>
+        <w:jc w:val="center"/>
+        <w:tblLook w:firstColumn="1" w:firstRow="1" w:lastColumn="0" w:lastRow="0" w:noHBand="0" w:noVBand="1" w:val="04A0"/>
+      </w:tblPr>
+      <w:tblGrid>
+        <w:gridCol w:w="1728"/>
+        <w:gridCol w:w="1728"/>
+        <w:gridCol w:w="1728"/>
+        <w:gridCol w:w="1728"/>
+        <w:gridCol w:w="1728"/>
+      </w:tblGrid>
+      <w:tr>
+        <w:tc>
+          <w:tcPr>
+            <w:tcW w:type="dxa" w:w="1134"/>
+          </w:tcPr>
+          <w:p>
+            <w:r>
+              <w:rPr>
+                <w:b/>
+              </w:rPr>
+              <w:t>Item</w:t>
+            </w:r>
+          </w:p>
+        </w:tc>
+        <w:tc>
+          <w:tcPr>
+            <w:tcW w:type="dxa" w:w="2835"/>
+          </w:tcPr>
+          <w:p>
+            <w:r>
+              <w:rPr>
+                <w:b/>
+              </w:rPr>
+              <w:t>Cuenta</w:t>
+            </w:r>
+          </w:p>
+        </w:tc>
+        <w:tc>
+          <w:tcPr>
+            <w:tcW w:type="dxa" w:w="1134"/>
+          </w:tcPr>
+          <w:p>
+            <w:r>
+              <w:rPr>
+                <w:b/>
+              </w:rPr>
+              <w:t>D/H</w:t>
+            </w:r>
+          </w:p>
+        </w:tc>
+        <w:tc>
+          <w:tcPr>
+            <w:tcW w:type="dxa" w:w="3402"/>
+          </w:tcPr>
+          <w:p>
+            <w:r>
+              <w:rPr>
+                <w:b/>
+              </w:rPr>
+              <w:t>Detalle</w:t>
+            </w:r>
+          </w:p>
+        </w:tc>
+        <w:tc>
+          <w:tcPr>
+            <w:tcW w:type="dxa" w:w="1701"/>
+          </w:tcPr>
+          <w:p>
+            <w:r>
+              <w:rPr>
+                <w:b/>
+              </w:rPr>
+              <w:t>Monto (S/)</w:t>
+            </w:r>
+          </w:p>
+        </w:tc>
+      </w:tr>
+      <w:tr>
+        <w:tc>
+          <w:tcPr>
+            <w:tcW w:type="dxa" w:w="1134"/>
+          </w:tcPr>
+          <w:p>
+            <w:r>
+              <w:t>1</w:t>
+            </w:r>
+          </w:p>
+        </w:tc>
+        <w:tc>
+          <w:tcPr>
+            <w:tcW w:type="dxa" w:w="2835"/>
+          </w:tcPr>
+          <w:p>
+            <w:r>
+              <w:t>35110101</w:t>
+            </w:r>
+          </w:p>
+        </w:tc>
+        <w:tc>
+          <w:tcPr>
+            <w:tcW w:type="dxa" w:w="1134"/>
+          </w:tcPr>
+          <w:p>
+            <w:r>
+              <w:t>D</w:t>
+            </w:r>
+          </w:p>
+        </w:tc>
+        <w:tc>
+          <w:tcPr>
+            <w:tcW w:type="dxa" w:w="3402"/>
+          </w:tcPr>
+          <w:p>
+            <w:r>
+              <w:t>Paloma (SU00000001): sube de 2,800 a 3,300</w:t>
+            </w:r>
+          </w:p>
+        </w:tc>
+        <w:tc>
+          <w:tcPr>
+            <w:tcW w:type="dxa" w:w="1701"/>
+          </w:tcPr>
+          <w:p>
+            <w:r>
+              <w:t>500.00</w:t>
+            </w:r>
+          </w:p>
+        </w:tc>
+      </w:tr>
+      <w:tr>
+        <w:tc>
+          <w:tcPr>
+            <w:tcW w:type="dxa" w:w="1134"/>
+          </w:tcPr>
+          <w:p>
+            <w:r>
+              <w:t>2</w:t>
+            </w:r>
+          </w:p>
+        </w:tc>
+        <w:tc>
+          <w:tcPr>
+            <w:tcW w:type="dxa" w:w="2835"/>
+          </w:tcPr>
+          <w:p>
+            <w:r>
+              <w:t>76201101</w:t>
+            </w:r>
+          </w:p>
+        </w:tc>
+        <w:tc>
+          <w:tcPr>
+            <w:tcW w:type="dxa" w:w="1134"/>
+          </w:tcPr>
+          <w:p>
+            <w:r>
+              <w:t>H</w:t>
+            </w:r>
+          </w:p>
+        </w:tc>
+        <w:tc>
+          <w:tcPr>
+            <w:tcW w:type="dxa" w:w="3402"/>
+          </w:tcPr>
+          <w:p>
+            <w:r>
+              <w:t>Ganancia por revaluacion - Paloma</w:t>
+            </w:r>
+          </w:p>
+        </w:tc>
+        <w:tc>
+          <w:tcPr>
+            <w:tcW w:type="dxa" w:w="1701"/>
+          </w:tcPr>
+          <w:p>
+            <w:r>
+              <w:t>500.00</w:t>
+            </w:r>
+          </w:p>
+        </w:tc>
+      </w:tr>
+      <w:tr>
+        <w:tc>
+          <w:tcPr>
+            <w:tcW w:type="dxa" w:w="1134"/>
+          </w:tcPr>
+          <w:p>
+            <w:r>
+              <w:t>3</w:t>
+            </w:r>
+          </w:p>
+        </w:tc>
+        <w:tc>
+          <w:tcPr>
+            <w:tcW w:type="dxa" w:w="2835"/>
+          </w:tcPr>
+          <w:p>
+            <w:r>
+              <w:t>35110101</w:t>
+            </w:r>
+          </w:p>
+        </w:tc>
+        <w:tc>
+          <w:tcPr>
+            <w:tcW w:type="dxa" w:w="1134"/>
+          </w:tcPr>
+          <w:p>
+            <w:r>
+              <w:t>D</w:t>
+            </w:r>
+          </w:p>
+        </w:tc>
+        <w:tc>
+          <w:tcPr>
+            <w:tcW w:type="dxa" w:w="3402"/>
+          </w:tcPr>
+          <w:p>
+            <w:r>
+              <w:t>Luna (SU00000002): sube de 2,700 a 3,200</w:t>
+            </w:r>
+          </w:p>
+        </w:tc>
+        <w:tc>
+          <w:tcPr>
+            <w:tcW w:type="dxa" w:w="1701"/>
+          </w:tcPr>
+          <w:p>
+            <w:r>
+              <w:t>500.00</w:t>
+            </w:r>
+          </w:p>
+        </w:tc>
+      </w:tr>
+      <w:tr>
+        <w:tc>
+          <w:tcPr>
+            <w:tcW w:type="dxa" w:w="1134"/>
+          </w:tcPr>
+          <w:p>
+            <w:r>
+              <w:t>4</w:t>
+            </w:r>
+          </w:p>
+        </w:tc>
+        <w:tc>
+          <w:tcPr>
+            <w:tcW w:type="dxa" w:w="2835"/>
+          </w:tcPr>
+          <w:p>
+            <w:r>
+              <w:t>76201101</w:t>
+            </w:r>
+          </w:p>
+        </w:tc>
+        <w:tc>
+          <w:tcPr>
+            <w:tcW w:type="dxa" w:w="1134"/>
+          </w:tcPr>
+          <w:p>
+            <w:r>
+              <w:t>H</w:t>
+            </w:r>
+          </w:p>
+        </w:tc>
+        <w:tc>
+          <w:tcPr>
+            <w:tcW w:type="dxa" w:w="3402"/>
+          </w:tcPr>
+          <w:p>
+            <w:r>
+              <w:t>Ganancia por revaluacion - Luna</w:t>
+            </w:r>
+          </w:p>
+        </w:tc>
+        <w:tc>
+          <w:tcPr>
+            <w:tcW w:type="dxa" w:w="1701"/>
+          </w:tcPr>
+          <w:p>
+            <w:r>
+              <w:t>500.00</w:t>
+            </w:r>
+          </w:p>
+        </w:tc>
+      </w:tr>
+      <w:tr>
+        <w:tc>
+          <w:tcPr>
+            <w:tcW w:type="dxa" w:w="1134"/>
+          </w:tcPr>
+          <w:p>
+            <w:r>
+              <w:t>5</w:t>
+            </w:r>
+          </w:p>
+        </w:tc>
+        <w:tc>
+          <w:tcPr>
+            <w:tcW w:type="dxa" w:w="2835"/>
+          </w:tcPr>
+          <w:p>
+            <w:r>
+              <w:t>66201101 (Perdida a valor razonable, subcuenta nueva propuesta)</w:t>
+            </w:r>
+          </w:p>
+        </w:tc>
+        <w:tc>
+          <w:tcPr>
+            <w:tcW w:type="dxa" w:w="1134"/>
+          </w:tcPr>
+          <w:p>
+            <w:r>
+              <w:t>D</w:t>
+            </w:r>
+          </w:p>
+        </w:tc>
+        <w:tc>
+          <w:tcPr>
+            <w:tcW w:type="dxa" w:w="3402"/>
+          </w:tcPr>
+          <w:p>
+            <w:r>
+              <w:t>Ejemplo: animal categoria TOR baja de 3,700 a 400 (descarte por vejez)</w:t>
+            </w:r>
+          </w:p>
+        </w:tc>
+        <w:tc>
+          <w:tcPr>
+            <w:tcW w:type="dxa" w:w="1701"/>
+          </w:tcPr>
+          <w:p>
+            <w:r>
+              <w:t>3,200.00</w:t>
+            </w:r>
+          </w:p>
+        </w:tc>
+      </w:tr>
+      <w:tr>
+        <w:tc>
+          <w:tcPr>
+            <w:tcW w:type="dxa" w:w="1134"/>
+          </w:tcPr>
+          <w:p>
+            <w:r>
+              <w:t>6</w:t>
+            </w:r>
+          </w:p>
+        </w:tc>
+        <w:tc>
+          <w:tcPr>
+            <w:tcW w:type="dxa" w:w="2835"/>
+          </w:tcPr>
+          <w:p>
+            <w:r>
+              <w:t>35110101</w:t>
+            </w:r>
+          </w:p>
+        </w:tc>
+        <w:tc>
+          <w:tcPr>
+            <w:tcW w:type="dxa" w:w="1134"/>
+          </w:tcPr>
+          <w:p>
+            <w:r>
+              <w:t>H</w:t>
+            </w:r>
+          </w:p>
+        </w:tc>
+        <w:tc>
+          <w:tcPr>
+            <w:tcW w:type="dxa" w:w="3402"/>
+          </w:tcPr>
+          <w:p>
+            <w:r>
+              <w:t>Baja de valor razonable - ejemplo</w:t>
+            </w:r>
+          </w:p>
+        </w:tc>
+        <w:tc>
+          <w:tcPr>
+            <w:tcW w:type="dxa" w:w="1701"/>
+          </w:tcPr>
+          <w:p>
+            <w:r>
+              <w:t>3,200.00</w:t>
+            </w:r>
+          </w:p>
+        </w:tc>
+      </w:tr>
+    </w:tbl>
+    <w:p/>
+    <w:p>
+      <w:r>
+        <w:rPr>
+          <w:b/>
+          <w:i/>
+        </w:rPr>
+        <w:t xml:space="preserve">Nota: </w:t>
+      </w:r>
+      <w:r>
+        <w:rPr>
+          <w:i/>
+        </w:rPr>
+        <w:t>las ganancias y perdidas no se compensan entre si: cada una se registra con su propia contrapartida. En este ejemplo el asiento cuadra en 4,200.00 al debe y 4,200.00 al haber.</w:t>
+      </w:r>
+    </w:p>
     <w:sectPr>
       <w:pgSz w:w="12240" w:h="15840"/>
       <w:pgMar w:top="1440" w:right="1800" w:bottom="1440" w:left="1800" w:header="720" w:footer="720" w:gutter="0"/>

</xml_diff>